<commit_message>
Add missing Close Grip pull-up to Vinz Feller's progression block
Block C's intro and the baselines[] table both promised tracked
progression across all three tested grips (wide/standard/close), and
the summary's 8-week milestone already claimed assistance would be
"reduced across all three grips" — but the exercises[] array only
programmed Wide and Standard, silently dropping Close Grip from actual
training content. Found while reviewing yesterday's antagonist-rotation
fix to this same block. Added the missing exercise; the resulting
3-in-a-row pull-pattern sequence is covered by CLAUDE.md's named
grip/skill-progression exemption (this is the exact example case cited
there), so no Antagonist Rotation Rule violation is introduced.

Co-Authored-By: Claude Sonnet 5 <noreply@anthropic.com>
Claude-Session: https://claude.ai/code/session_01VTRA12TAy4P16NRVKS4SK5
</commit_message>
<xml_diff>
--- a/clients/vinz_feller/Vinz_Feller_3Day_Training_Plan.docx
+++ b/clients/vinz_feller/Vinz_Feller_3Day_Training_Plan.docx
@@ -8687,6 +8687,235 @@
                 <w:szCs w:val="17"/>
               </w:rPr>
               <w:t xml:space="preserve">Full stretch at bottom; controlled descent.</w:t>
+            </w:r>
+          </w:p>
+        </w:tc>
+      </w:tr>
+      <w:tr>
+        <w:tc>
+          <w:tcPr>
+            <w:tcW w:type="dxa" w:w="2400"/>
+            <w:tcBorders>
+              <w:top w:val="none" w:color="FFFFFF" w:sz="0"/>
+              <w:left w:val="none" w:color="FFFFFF" w:sz="0"/>
+              <w:bottom w:val="none" w:color="FFFFFF" w:sz="0"/>
+              <w:right w:val="none" w:color="FFFFFF" w:sz="0"/>
+            </w:tcBorders>
+            <w:shd w:fill="F8F4FB" w:color="auto" w:val="clear"/>
+            <w:tcMar>
+              <w:top w:type="dxa" w:w="40"/>
+              <w:left w:type="dxa" w:w="80"/>
+              <w:bottom w:type="dxa" w:w="40"/>
+              <w:right w:type="dxa" w:w="80"/>
+            </w:tcMar>
+            <w:vAlign w:val="center"/>
+          </w:tcPr>
+          <w:p>
+            <w:r>
+              <w:rPr>
+                <w:rFonts w:ascii="Arial" w:cs="Arial" w:eastAsia="Arial" w:hAnsi="Arial"/>
+                <w:b/>
+                <w:bCs/>
+                <w:color w:val="2C2C2C"/>
+                <w:sz w:val="18"/>
+                <w:szCs w:val="18"/>
+              </w:rPr>
+              <w:t xml:space="preserve">Assisted Pull-Up (Close Grip)</w:t>
+            </w:r>
+          </w:p>
+        </w:tc>
+        <w:tc>
+          <w:tcPr>
+            <w:tcW w:type="dxa" w:w="380"/>
+            <w:tcBorders>
+              <w:top w:val="none" w:color="FFFFFF" w:sz="0"/>
+              <w:left w:val="none" w:color="FFFFFF" w:sz="0"/>
+              <w:bottom w:val="none" w:color="FFFFFF" w:sz="0"/>
+              <w:right w:val="none" w:color="FFFFFF" w:sz="0"/>
+            </w:tcBorders>
+            <w:shd w:fill="F8F4FB" w:color="auto" w:val="clear"/>
+            <w:tcMar>
+              <w:top w:type="dxa" w:w="40"/>
+              <w:left w:type="dxa" w:w="80"/>
+              <w:bottom w:type="dxa" w:w="40"/>
+              <w:right w:type="dxa" w:w="80"/>
+            </w:tcMar>
+            <w:vAlign w:val="center"/>
+          </w:tcPr>
+          <w:p>
+            <w:pPr>
+              <w:jc w:val="center"/>
+            </w:pPr>
+            <w:r>
+              <w:rPr>
+                <w:rFonts w:ascii="Arial" w:cs="Arial" w:eastAsia="Arial" w:hAnsi="Arial"/>
+                <w:color w:val="6B6B6B"/>
+                <w:sz w:val="15"/>
+                <w:szCs w:val="15"/>
+              </w:rPr>
+              <w:t xml:space="preserve">2</w:t>
+            </w:r>
+          </w:p>
+        </w:tc>
+        <w:tc>
+          <w:tcPr>
+            <w:tcW w:type="dxa" w:w="420"/>
+            <w:tcBorders>
+              <w:top w:val="none" w:color="FFFFFF" w:sz="0"/>
+              <w:left w:val="none" w:color="FFFFFF" w:sz="0"/>
+              <w:bottom w:val="none" w:color="FFFFFF" w:sz="0"/>
+              <w:right w:val="none" w:color="FFFFFF" w:sz="0"/>
+            </w:tcBorders>
+            <w:shd w:fill="F8F4FB" w:color="auto" w:val="clear"/>
+            <w:tcMar>
+              <w:top w:type="dxa" w:w="40"/>
+              <w:left w:type="dxa" w:w="80"/>
+              <w:bottom w:type="dxa" w:w="40"/>
+              <w:right w:type="dxa" w:w="80"/>
+            </w:tcMar>
+            <w:vAlign w:val="center"/>
+          </w:tcPr>
+          <w:p>
+            <w:pPr>
+              <w:jc w:val="center"/>
+            </w:pPr>
+            <w:r>
+              <w:rPr>
+                <w:rFonts w:ascii="Arial" w:cs="Arial" w:eastAsia="Arial" w:hAnsi="Arial"/>
+                <w:color w:val="6B6B6B"/>
+                <w:sz w:val="15"/>
+                <w:szCs w:val="15"/>
+              </w:rPr>
+              <w:t xml:space="preserve">8–10</w:t>
+            </w:r>
+          </w:p>
+        </w:tc>
+        <w:tc>
+          <w:tcPr>
+            <w:tcW w:type="dxa" w:w="680"/>
+            <w:tcBorders>
+              <w:top w:val="none" w:color="FFFFFF" w:sz="0"/>
+              <w:left w:val="none" w:color="FFFFFF" w:sz="0"/>
+              <w:bottom w:val="none" w:color="FFFFFF" w:sz="0"/>
+              <w:right w:val="none" w:color="FFFFFF" w:sz="0"/>
+            </w:tcBorders>
+            <w:shd w:fill="F8F4FB" w:color="auto" w:val="clear"/>
+            <w:tcMar>
+              <w:top w:type="dxa" w:w="40"/>
+              <w:left w:type="dxa" w:w="80"/>
+              <w:bottom w:type="dxa" w:w="40"/>
+              <w:right w:type="dxa" w:w="80"/>
+            </w:tcMar>
+            <w:vAlign w:val="center"/>
+          </w:tcPr>
+          <w:p>
+            <w:pPr>
+              <w:jc w:val="center"/>
+            </w:pPr>
+            <w:r>
+              <w:rPr>
+                <w:rFonts w:ascii="Arial" w:cs="Arial" w:eastAsia="Arial" w:hAnsi="Arial"/>
+                <w:color w:val="6B6B6B"/>
+                <w:sz w:val="15"/>
+                <w:szCs w:val="15"/>
+              </w:rPr>
+              <w:t xml:space="preserve">Reduced assist</w:t>
+            </w:r>
+          </w:p>
+        </w:tc>
+        <w:tc>
+          <w:tcPr>
+            <w:tcW w:type="dxa" w:w="540"/>
+            <w:tcBorders>
+              <w:top w:val="none" w:color="FFFFFF" w:sz="0"/>
+              <w:left w:val="none" w:color="FFFFFF" w:sz="0"/>
+              <w:bottom w:val="none" w:color="FFFFFF" w:sz="0"/>
+              <w:right w:val="none" w:color="FFFFFF" w:sz="0"/>
+            </w:tcBorders>
+            <w:shd w:fill="F8F4FB" w:color="auto" w:val="clear"/>
+            <w:tcMar>
+              <w:top w:type="dxa" w:w="40"/>
+              <w:left w:type="dxa" w:w="80"/>
+              <w:bottom w:type="dxa" w:w="40"/>
+              <w:right w:type="dxa" w:w="80"/>
+            </w:tcMar>
+            <w:vAlign w:val="center"/>
+          </w:tcPr>
+          <w:p>
+            <w:pPr>
+              <w:jc w:val="center"/>
+            </w:pPr>
+            <w:r>
+              <w:rPr>
+                <w:rFonts w:ascii="Arial" w:cs="Arial" w:eastAsia="Arial" w:hAnsi="Arial"/>
+                <w:color w:val="6B6B6B"/>
+                <w:sz w:val="15"/>
+                <w:szCs w:val="15"/>
+              </w:rPr>
+              <w:t xml:space="preserve">Controlled</w:t>
+            </w:r>
+          </w:p>
+        </w:tc>
+        <w:tc>
+          <w:tcPr>
+            <w:tcW w:type="dxa" w:w="440"/>
+            <w:tcBorders>
+              <w:top w:val="none" w:color="FFFFFF" w:sz="0"/>
+              <w:left w:val="none" w:color="FFFFFF" w:sz="0"/>
+              <w:bottom w:val="none" w:color="FFFFFF" w:sz="0"/>
+              <w:right w:val="none" w:color="FFFFFF" w:sz="0"/>
+            </w:tcBorders>
+            <w:shd w:fill="F8F4FB" w:color="auto" w:val="clear"/>
+            <w:tcMar>
+              <w:top w:type="dxa" w:w="40"/>
+              <w:left w:type="dxa" w:w="80"/>
+              <w:bottom w:type="dxa" w:w="40"/>
+              <w:right w:type="dxa" w:w="80"/>
+            </w:tcMar>
+            <w:vAlign w:val="center"/>
+          </w:tcPr>
+          <w:p>
+            <w:pPr>
+              <w:jc w:val="center"/>
+            </w:pPr>
+            <w:r>
+              <w:rPr>
+                <w:rFonts w:ascii="Arial" w:cs="Arial" w:eastAsia="Arial" w:hAnsi="Arial"/>
+                <w:color w:val="6B6B6B"/>
+                <w:sz w:val="15"/>
+                <w:szCs w:val="15"/>
+              </w:rPr>
+              <w:t xml:space="preserve">90s</w:t>
+            </w:r>
+          </w:p>
+        </w:tc>
+        <w:tc>
+          <w:tcPr>
+            <w:tcW w:type="dxa" w:w="5580"/>
+            <w:tcBorders>
+              <w:top w:val="none" w:color="FFFFFF" w:sz="0"/>
+              <w:left w:val="none" w:color="FFFFFF" w:sz="0"/>
+              <w:bottom w:val="none" w:color="FFFFFF" w:sz="0"/>
+              <w:right w:val="none" w:color="FFFFFF" w:sz="0"/>
+            </w:tcBorders>
+            <w:shd w:fill="F8F4FB" w:color="auto" w:val="clear"/>
+            <w:tcMar>
+              <w:top w:type="dxa" w:w="40"/>
+              <w:left w:type="dxa" w:w="80"/>
+              <w:bottom w:type="dxa" w:w="40"/>
+              <w:right w:type="dxa" w:w="80"/>
+            </w:tcMar>
+            <w:vAlign w:val="center"/>
+          </w:tcPr>
+          <w:p>
+            <w:r>
+              <w:rPr>
+                <w:rFonts w:ascii="Arial" w:cs="Arial" w:eastAsia="Arial" w:hAnsi="Arial"/>
+                <w:color w:val="6B6B6B"/>
+                <w:sz w:val="17"/>
+                <w:szCs w:val="17"/>
+              </w:rPr>
+              <w:t xml:space="preserve">Hands inside shoulder width; reduce assist vs test.</w:t>
             </w:r>
           </w:p>
         </w:tc>

</xml_diff>